<commit_message>
feat: add wallet and payment recharge screen for shop partners
</commit_message>
<xml_diff>
--- a/Krishinex Milk Services.docx
+++ b/Krishinex Milk Services.docx
@@ -13,7 +13,6 @@
           <w:lang w:val="en-US"/>
         </w:rPr>
       </w:pPr>
-      <w:proofErr w:type="spellStart"/>
       <w:r>
         <w:rPr>
           <w:b/>
@@ -24,7 +23,6 @@
         </w:rPr>
         <w:t>Krishinex</w:t>
       </w:r>
-      <w:proofErr w:type="spellEnd"/>
       <w:r>
         <w:rPr>
           <w:b/>
@@ -43,9 +41,8 @@
           <w:szCs w:val="42"/>
           <w:lang w:val="en-US"/>
         </w:rPr>
-        <w:t xml:space="preserve"> &amp; Premium </w:t>
-      </w:r>
-      <w:proofErr w:type="gramStart"/>
+        <w:t xml:space="preserve"> &amp; Premium Farmer </w:t>
+      </w:r>
       <w:r>
         <w:rPr>
           <w:b/>
@@ -54,28 +51,7 @@
           <w:szCs w:val="42"/>
           <w:lang w:val="en-US"/>
         </w:rPr>
-        <w:t xml:space="preserve">Farmer </w:t>
-      </w:r>
-      <w:r>
-        <w:rPr>
-          <w:b/>
-          <w:bCs/>
-          <w:sz w:val="42"/>
-          <w:szCs w:val="42"/>
-          <w:lang w:val="en-US"/>
-        </w:rPr>
-        <w:t xml:space="preserve"> Features</w:t>
-      </w:r>
-      <w:proofErr w:type="gramEnd"/>
-      <w:r>
-        <w:rPr>
-          <w:b/>
-          <w:bCs/>
-          <w:sz w:val="42"/>
-          <w:szCs w:val="42"/>
-          <w:lang w:val="en-US"/>
-        </w:rPr>
-        <w:t xml:space="preserve"> Implementation Plan</w:t>
+        <w:t xml:space="preserve"> Features Implementation Plan</w:t>
       </w:r>
     </w:p>
     <w:p>
@@ -114,6 +90,15 @@
           <w:szCs w:val="24"/>
         </w:rPr>
         <w:t>1. New Section on the User App Homepage</w:t>
+      </w:r>
+      <w:r>
+        <w:rPr>
+          <w:b/>
+          <w:bCs/>
+          <w:sz w:val="24"/>
+          <w:szCs w:val="24"/>
+        </w:rPr>
+        <w:t xml:space="preserve"> =&gt; 30 min</w:t>
       </w:r>
     </w:p>
     <w:p>
@@ -181,17 +166,8 @@
           <w:sz w:val="24"/>
           <w:szCs w:val="24"/>
         </w:rPr>
-        <w:t xml:space="preserve">Mandi </w:t>
-      </w:r>
-      <w:proofErr w:type="spellStart"/>
-      <w:r>
-        <w:rPr>
-          <w:sz w:val="24"/>
-          <w:szCs w:val="24"/>
-        </w:rPr>
-        <w:t>Janch</w:t>
-      </w:r>
-      <w:proofErr w:type="spellEnd"/>
+        <w:t>Mandi Janch</w:t>
+      </w:r>
     </w:p>
     <w:p>
       <w:pPr>
@@ -204,21 +180,12 @@
           <w:szCs w:val="24"/>
         </w:rPr>
       </w:pPr>
-      <w:proofErr w:type="spellStart"/>
-      <w:r>
-        <w:rPr>
-          <w:sz w:val="24"/>
-          <w:szCs w:val="24"/>
-        </w:rPr>
-        <w:t>Upkaran</w:t>
-      </w:r>
-      <w:proofErr w:type="spellEnd"/>
-      <w:r>
-        <w:rPr>
-          <w:sz w:val="24"/>
-          <w:szCs w:val="24"/>
-        </w:rPr>
-        <w:t xml:space="preserve"> / Labour</w:t>
+      <w:r>
+        <w:rPr>
+          <w:sz w:val="24"/>
+          <w:szCs w:val="24"/>
+        </w:rPr>
+        <w:t>Upkaran / Labour</w:t>
       </w:r>
     </w:p>
     <w:p>
@@ -237,33 +204,8 @@
           <w:sz w:val="24"/>
           <w:szCs w:val="24"/>
         </w:rPr>
-        <w:t xml:space="preserve">Doctor Se </w:t>
-      </w:r>
-      <w:proofErr w:type="spellStart"/>
-      <w:r>
-        <w:rPr>
-          <w:sz w:val="24"/>
-          <w:szCs w:val="24"/>
-        </w:rPr>
-        <w:t>Sampark</w:t>
-      </w:r>
-      <w:proofErr w:type="spellEnd"/>
-      <w:r>
-        <w:rPr>
-          <w:sz w:val="24"/>
-          <w:szCs w:val="24"/>
-        </w:rPr>
-        <w:t xml:space="preserve"> </w:t>
-      </w:r>
-      <w:proofErr w:type="spellStart"/>
-      <w:r>
-        <w:rPr>
-          <w:sz w:val="24"/>
-          <w:szCs w:val="24"/>
-        </w:rPr>
-        <w:t>Karein</w:t>
-      </w:r>
-      <w:proofErr w:type="spellEnd"/>
+        <w:t>Doctor Se Sampark Karein</w:t>
+      </w:r>
     </w:p>
     <w:p>
       <w:pPr>
@@ -386,6 +328,33 @@
         </w:rPr>
         <w:t>2. Sell Milk</w:t>
       </w:r>
+      <w:r>
+        <w:rPr>
+          <w:b/>
+          <w:bCs/>
+          <w:sz w:val="24"/>
+          <w:szCs w:val="24"/>
+        </w:rPr>
+        <w:t xml:space="preserve"> =&gt; </w:t>
+      </w:r>
+      <w:r>
+        <w:rPr>
+          <w:b/>
+          <w:bCs/>
+          <w:sz w:val="24"/>
+          <w:szCs w:val="24"/>
+        </w:rPr>
+        <w:t>3</w:t>
+      </w:r>
+      <w:r>
+        <w:rPr>
+          <w:b/>
+          <w:bCs/>
+          <w:sz w:val="24"/>
+          <w:szCs w:val="24"/>
+        </w:rPr>
+        <w:t xml:space="preserve"> hours</w:t>
+      </w:r>
     </w:p>
     <w:p>
       <w:pPr>
@@ -837,6 +806,15 @@
         </w:rPr>
         <w:t>3. Buy Milk</w:t>
       </w:r>
+      <w:r>
+        <w:rPr>
+          <w:b/>
+          <w:bCs/>
+          <w:sz w:val="24"/>
+          <w:szCs w:val="24"/>
+        </w:rPr>
+        <w:t xml:space="preserve"> =&gt; 3 hours</w:t>
+      </w:r>
     </w:p>
     <w:p>
       <w:pPr>
@@ -1338,6 +1316,15 @@
         </w:rPr>
         <w:t>4. Wallet Management</w:t>
       </w:r>
+      <w:r>
+        <w:rPr>
+          <w:b/>
+          <w:bCs/>
+          <w:sz w:val="24"/>
+          <w:szCs w:val="24"/>
+        </w:rPr>
+        <w:t xml:space="preserve"> =&gt; 2 hours</w:t>
+      </w:r>
     </w:p>
     <w:p>
       <w:pPr>
@@ -1409,23 +1396,7 @@
           <w:sz w:val="24"/>
           <w:szCs w:val="24"/>
         </w:rPr>
-        <w:t xml:space="preserve">The milk seller will be able to withdraw the eligible amount from their Milk Wallet to their main </w:t>
-      </w:r>
-      <w:proofErr w:type="spellStart"/>
-      <w:r>
-        <w:rPr>
-          <w:sz w:val="24"/>
-          <w:szCs w:val="24"/>
-        </w:rPr>
-        <w:t>KrishiNex</w:t>
-      </w:r>
-      <w:proofErr w:type="spellEnd"/>
-      <w:r>
-        <w:rPr>
-          <w:sz w:val="24"/>
-          <w:szCs w:val="24"/>
-        </w:rPr>
-        <w:t xml:space="preserve"> wallet.</w:t>
+        <w:t>The milk seller will be able to withdraw the eligible amount from their Milk Wallet to their main KrishiNex wallet.</w:t>
       </w:r>
     </w:p>
     <w:p>
@@ -1607,23 +1578,7 @@
           <w:sz w:val="24"/>
           <w:szCs w:val="24"/>
         </w:rPr>
-        <w:t xml:space="preserve">When the seller withdraws the amount, the eligible balance for that period will be transferred to their main </w:t>
-      </w:r>
-      <w:proofErr w:type="spellStart"/>
-      <w:r>
-        <w:rPr>
-          <w:sz w:val="24"/>
-          <w:szCs w:val="24"/>
-        </w:rPr>
-        <w:t>KrishiNex</w:t>
-      </w:r>
-      <w:proofErr w:type="spellEnd"/>
-      <w:r>
-        <w:rPr>
-          <w:sz w:val="24"/>
-          <w:szCs w:val="24"/>
-        </w:rPr>
-        <w:t xml:space="preserve"> wallet.</w:t>
+        <w:t>When the seller withdraws the amount, the eligible balance for that period will be transferred to their main KrishiNex wallet.</w:t>
       </w:r>
     </w:p>
     <w:p>
@@ -1785,6 +1740,15 @@
           <w:szCs w:val="24"/>
         </w:rPr>
         <w:t>1. Milk Partner Option</w:t>
+      </w:r>
+      <w:r>
+        <w:rPr>
+          <w:b/>
+          <w:bCs/>
+          <w:sz w:val="24"/>
+          <w:szCs w:val="24"/>
+        </w:rPr>
+        <w:t xml:space="preserve"> =&gt; 1 hours</w:t>
       </w:r>
     </w:p>
     <w:p>
@@ -2097,6 +2061,15 @@
         </w:rPr>
         <w:t>3. Milk Partner Dashboard</w:t>
       </w:r>
+      <w:r>
+        <w:rPr>
+          <w:b/>
+          <w:bCs/>
+          <w:sz w:val="24"/>
+          <w:szCs w:val="24"/>
+        </w:rPr>
+        <w:t xml:space="preserve"> =&gt; 30 min</w:t>
+      </w:r>
     </w:p>
     <w:p>
       <w:pPr>
@@ -2203,6 +2176,15 @@
         </w:rPr>
         <w:t>4. Milk Purchase and Milk Sales</w:t>
       </w:r>
+      <w:r>
+        <w:rPr>
+          <w:b/>
+          <w:bCs/>
+          <w:sz w:val="24"/>
+          <w:szCs w:val="24"/>
+        </w:rPr>
+        <w:t xml:space="preserve"> =&gt; 3 hours</w:t>
+      </w:r>
     </w:p>
     <w:p>
       <w:pPr>
@@ -2267,6 +2249,15 @@
           <w:szCs w:val="24"/>
         </w:rPr>
         <w:t>Option 2: Milk Sales</w:t>
+      </w:r>
+      <w:r>
+        <w:rPr>
+          <w:b/>
+          <w:bCs/>
+          <w:sz w:val="24"/>
+          <w:szCs w:val="24"/>
+        </w:rPr>
+        <w:t xml:space="preserve"> =&gt;</w:t>
       </w:r>
     </w:p>
     <w:p>
@@ -2432,137 +2423,8 @@
           <w:sz w:val="24"/>
           <w:szCs w:val="24"/>
         </w:rPr>
-        <w:t>6. Performance and Sales Reports</w:t>
-      </w:r>
-    </w:p>
-    <w:p>
-      <w:pPr>
-        <w:rPr>
-          <w:sz w:val="24"/>
-          <w:szCs w:val="24"/>
-        </w:rPr>
-      </w:pPr>
-      <w:r>
-        <w:rPr>
-          <w:sz w:val="24"/>
-          <w:szCs w:val="24"/>
-        </w:rPr>
-        <w:t>The Milk Partner will be able to view their individual performance and sales information through the dashboard.</w:t>
-      </w:r>
-    </w:p>
-    <w:p>
-      <w:pPr>
-        <w:rPr>
-          <w:sz w:val="24"/>
-          <w:szCs w:val="24"/>
-        </w:rPr>
-      </w:pPr>
-      <w:r>
-        <w:rPr>
-          <w:sz w:val="24"/>
-          <w:szCs w:val="24"/>
-        </w:rPr>
-        <w:t>This will include their milk purchase details, milk sales details, and other relevant performance records.</w:t>
-      </w:r>
-    </w:p>
-    <w:p>
-      <w:pPr>
-        <w:rPr>
-          <w:sz w:val="24"/>
-          <w:szCs w:val="24"/>
-          <w:lang w:val="en-US"/>
-        </w:rPr>
-      </w:pPr>
-    </w:p>
-    <w:p>
-      <w:pPr>
-        <w:rPr>
-          <w:sz w:val="24"/>
-          <w:szCs w:val="24"/>
-          <w:lang w:val="en-US"/>
-        </w:rPr>
-      </w:pPr>
-    </w:p>
-    <w:p>
-      <w:pPr>
-        <w:rPr>
-          <w:sz w:val="24"/>
-          <w:szCs w:val="24"/>
-          <w:lang w:val="en-US"/>
-        </w:rPr>
-      </w:pPr>
-    </w:p>
-    <w:p>
-      <w:pPr>
-        <w:rPr>
-          <w:sz w:val="24"/>
-          <w:szCs w:val="24"/>
-          <w:lang w:val="en-US"/>
-        </w:rPr>
-      </w:pPr>
-    </w:p>
-    <w:p>
-      <w:pPr>
-        <w:rPr>
-          <w:sz w:val="24"/>
-          <w:szCs w:val="24"/>
-          <w:lang w:val="en-US"/>
-        </w:rPr>
-      </w:pPr>
-    </w:p>
-    <w:p>
-      <w:pPr>
-        <w:rPr>
-          <w:sz w:val="24"/>
-          <w:szCs w:val="24"/>
-          <w:lang w:val="en-US"/>
-        </w:rPr>
-      </w:pPr>
-    </w:p>
-    <w:p>
-      <w:pPr>
-        <w:rPr>
-          <w:sz w:val="24"/>
-          <w:szCs w:val="24"/>
-          <w:lang w:val="en-US"/>
-        </w:rPr>
-      </w:pPr>
-    </w:p>
-    <w:p>
-      <w:pPr>
-        <w:rPr>
-          <w:sz w:val="24"/>
-          <w:szCs w:val="24"/>
-          <w:lang w:val="en-US"/>
-        </w:rPr>
-      </w:pPr>
-    </w:p>
-    <w:p>
-      <w:pPr>
-        <w:rPr>
-          <w:sz w:val="24"/>
-          <w:szCs w:val="24"/>
-          <w:lang w:val="en-US"/>
-        </w:rPr>
-      </w:pPr>
-    </w:p>
-    <w:p>
-      <w:pPr>
-        <w:rPr>
-          <w:sz w:val="24"/>
-          <w:szCs w:val="24"/>
-          <w:lang w:val="en-US"/>
-        </w:rPr>
-      </w:pPr>
-    </w:p>
-    <w:p>
-      <w:pPr>
-        <w:rPr>
-          <w:sz w:val="24"/>
-          <w:szCs w:val="24"/>
-          <w:lang w:val="en-US"/>
-        </w:rPr>
-      </w:pPr>
+        <w:br w:type="page"/>
+      </w:r>
     </w:p>
     <w:p>
       <w:pPr>
@@ -2582,6 +2444,24 @@
         </w:rPr>
         <w:lastRenderedPageBreak/>
         <w:t>Admin Panel – Milk Partner Management Module</w:t>
+      </w:r>
+      <w:r>
+        <w:rPr>
+          <w:b/>
+          <w:bCs/>
+          <w:sz w:val="24"/>
+          <w:szCs w:val="24"/>
+        </w:rPr>
+        <w:t xml:space="preserve"> </w:t>
+      </w:r>
+      <w:r>
+        <w:rPr>
+          <w:b/>
+          <w:bCs/>
+          <w:sz w:val="24"/>
+          <w:szCs w:val="24"/>
+        </w:rPr>
+        <w:t>=&gt; 2hours</w:t>
       </w:r>
     </w:p>
     <w:p>
@@ -3012,113 +2892,6 @@
         <w:rPr>
           <w:sz w:val="24"/>
           <w:szCs w:val="24"/>
-        </w:rPr>
-      </w:pPr>
-    </w:p>
-    <w:p>
-      <w:pPr>
-        <w:rPr>
-          <w:sz w:val="24"/>
-          <w:szCs w:val="24"/>
-          <w:lang w:val="en-US"/>
-        </w:rPr>
-      </w:pPr>
-    </w:p>
-    <w:p>
-      <w:pPr>
-        <w:rPr>
-          <w:sz w:val="24"/>
-          <w:szCs w:val="24"/>
-          <w:lang w:val="en-US"/>
-        </w:rPr>
-      </w:pPr>
-    </w:p>
-    <w:p>
-      <w:pPr>
-        <w:rPr>
-          <w:sz w:val="24"/>
-          <w:szCs w:val="24"/>
-          <w:lang w:val="en-US"/>
-        </w:rPr>
-      </w:pPr>
-    </w:p>
-    <w:p>
-      <w:pPr>
-        <w:rPr>
-          <w:sz w:val="24"/>
-          <w:szCs w:val="24"/>
-          <w:lang w:val="en-US"/>
-        </w:rPr>
-      </w:pPr>
-    </w:p>
-    <w:p>
-      <w:pPr>
-        <w:rPr>
-          <w:sz w:val="24"/>
-          <w:szCs w:val="24"/>
-          <w:lang w:val="en-US"/>
-        </w:rPr>
-      </w:pPr>
-    </w:p>
-    <w:p>
-      <w:pPr>
-        <w:rPr>
-          <w:sz w:val="24"/>
-          <w:szCs w:val="24"/>
-          <w:lang w:val="en-US"/>
-        </w:rPr>
-      </w:pPr>
-    </w:p>
-    <w:p>
-      <w:pPr>
-        <w:rPr>
-          <w:sz w:val="24"/>
-          <w:szCs w:val="24"/>
-          <w:lang w:val="en-US"/>
-        </w:rPr>
-      </w:pPr>
-    </w:p>
-    <w:p>
-      <w:pPr>
-        <w:rPr>
-          <w:sz w:val="24"/>
-          <w:szCs w:val="24"/>
-          <w:lang w:val="en-US"/>
-        </w:rPr>
-      </w:pPr>
-    </w:p>
-    <w:p>
-      <w:pPr>
-        <w:rPr>
-          <w:sz w:val="24"/>
-          <w:szCs w:val="24"/>
-          <w:lang w:val="en-US"/>
-        </w:rPr>
-      </w:pPr>
-    </w:p>
-    <w:p>
-      <w:pPr>
-        <w:rPr>
-          <w:sz w:val="24"/>
-          <w:szCs w:val="24"/>
-          <w:lang w:val="en-US"/>
-        </w:rPr>
-      </w:pPr>
-    </w:p>
-    <w:p>
-      <w:pPr>
-        <w:rPr>
-          <w:sz w:val="24"/>
-          <w:szCs w:val="24"/>
-          <w:lang w:val="en-US"/>
-        </w:rPr>
-      </w:pPr>
-    </w:p>
-    <w:p>
-      <w:pPr>
-        <w:rPr>
-          <w:sz w:val="24"/>
-          <w:szCs w:val="24"/>
           <w:lang w:val="en-US"/>
         </w:rPr>
       </w:pPr>
@@ -3139,6 +2912,7 @@
           <w:sz w:val="42"/>
           <w:szCs w:val="42"/>
         </w:rPr>
+        <w:lastRenderedPageBreak/>
         <w:t>KRISHINEX – PREMIUM FARMER MODULE</w:t>
       </w:r>
     </w:p>
@@ -3178,6 +2952,15 @@
           <w:szCs w:val="24"/>
         </w:rPr>
         <w:t>1. Farmer App – Join as Premium Farmer</w:t>
+      </w:r>
+      <w:r>
+        <w:rPr>
+          <w:b/>
+          <w:bCs/>
+          <w:sz w:val="24"/>
+          <w:szCs w:val="24"/>
+        </w:rPr>
+        <w:t xml:space="preserve"> =&gt; 2hours</w:t>
       </w:r>
     </w:p>
     <w:p>
@@ -3416,7 +3199,6 @@
           <w:sz w:val="24"/>
           <w:szCs w:val="24"/>
         </w:rPr>
-        <w:lastRenderedPageBreak/>
         <w:t>The app will inform the farmer that approval normally takes up to 24 hours during working hours.</w:t>
       </w:r>
     </w:p>
@@ -3457,6 +3239,15 @@
         </w:rPr>
         <w:t>2. Admin Panel – Premium Farmer Management</w:t>
       </w:r>
+      <w:r>
+        <w:rPr>
+          <w:b/>
+          <w:bCs/>
+          <w:sz w:val="24"/>
+          <w:szCs w:val="24"/>
+        </w:rPr>
+        <w:t xml:space="preserve"> =&gt; 1hours</w:t>
+      </w:r>
     </w:p>
     <w:p>
       <w:pPr>
@@ -3615,6 +3406,7 @@
           <w:sz w:val="24"/>
           <w:szCs w:val="24"/>
         </w:rPr>
+        <w:lastRenderedPageBreak/>
         <w:t>Display all Premium Farmer applications and their payment details.</w:t>
       </w:r>
     </w:p>
@@ -3697,326 +3489,15 @@
     <w:p>
       <w:pPr>
         <w:rPr>
-          <w:b/>
-          <w:bCs/>
-          <w:sz w:val="24"/>
-          <w:szCs w:val="24"/>
-        </w:rPr>
-      </w:pPr>
-      <w:r>
-        <w:rPr>
-          <w:b/>
-          <w:bCs/>
-          <w:sz w:val="24"/>
-          <w:szCs w:val="24"/>
-        </w:rPr>
-        <w:t>C. Farmer Details &amp; Limit Management</w:t>
-      </w:r>
-    </w:p>
-    <w:p>
-      <w:pPr>
-        <w:rPr>
-          <w:sz w:val="24"/>
-          <w:szCs w:val="24"/>
-        </w:rPr>
-      </w:pPr>
-      <w:r>
-        <w:rPr>
-          <w:sz w:val="24"/>
-          <w:szCs w:val="24"/>
-        </w:rPr>
-        <w:t>After opening a farmer's details, the admin will be able to configure the applicable limit for that Premium Farmer.</w:t>
-      </w:r>
-    </w:p>
-    <w:p>
-      <w:pPr>
-        <w:numPr>
-          <w:ilvl w:val="0"/>
-          <w:numId w:val="27"/>
-        </w:numPr>
-        <w:rPr>
-          <w:sz w:val="24"/>
-          <w:szCs w:val="24"/>
-        </w:rPr>
-      </w:pPr>
-      <w:r>
-        <w:rPr>
-          <w:sz w:val="24"/>
-          <w:szCs w:val="24"/>
-        </w:rPr>
-        <w:t>Set an individual limit for each farmer.</w:t>
-      </w:r>
-    </w:p>
-    <w:p>
-      <w:pPr>
-        <w:numPr>
-          <w:ilvl w:val="0"/>
-          <w:numId w:val="27"/>
-        </w:numPr>
-        <w:rPr>
-          <w:sz w:val="24"/>
-          <w:szCs w:val="24"/>
-        </w:rPr>
-      </w:pPr>
-      <w:r>
-        <w:rPr>
-          <w:sz w:val="24"/>
-          <w:szCs w:val="24"/>
-        </w:rPr>
-        <w:t>Update the limit when required.</w:t>
-      </w:r>
-    </w:p>
-    <w:p>
-      <w:pPr>
-        <w:numPr>
-          <w:ilvl w:val="0"/>
-          <w:numId w:val="27"/>
-        </w:numPr>
-        <w:rPr>
-          <w:sz w:val="24"/>
-          <w:szCs w:val="24"/>
-        </w:rPr>
-      </w:pPr>
-      <w:r>
-        <w:rPr>
-          <w:sz w:val="24"/>
-          <w:szCs w:val="24"/>
-        </w:rPr>
-        <w:t>View the currently assigned limit.</w:t>
-      </w:r>
-    </w:p>
-    <w:p>
-      <w:pPr>
-        <w:numPr>
-          <w:ilvl w:val="0"/>
-          <w:numId w:val="27"/>
-        </w:numPr>
-        <w:rPr>
-          <w:sz w:val="24"/>
-          <w:szCs w:val="24"/>
-        </w:rPr>
-      </w:pPr>
-      <w:r>
-        <w:rPr>
-          <w:sz w:val="24"/>
-          <w:szCs w:val="24"/>
-        </w:rPr>
-        <w:t>Maintain records of limit changes.</w:t>
-      </w:r>
-    </w:p>
-    <w:p>
-      <w:pPr>
-        <w:rPr>
-          <w:sz w:val="24"/>
-          <w:szCs w:val="24"/>
-        </w:rPr>
-      </w:pPr>
-      <w:r>
-        <w:rPr>
-          <w:sz w:val="24"/>
-          <w:szCs w:val="24"/>
-        </w:rPr>
-        <w:t>The exact type of limit, such as a credit limit or a transaction limit, will be configured according to the final business requirements.</w:t>
-      </w:r>
-    </w:p>
-    <w:p>
-      <w:pPr>
-        <w:rPr>
-          <w:b/>
-          <w:bCs/>
-          <w:sz w:val="24"/>
-          <w:szCs w:val="24"/>
-        </w:rPr>
-      </w:pPr>
-      <w:r>
-        <w:rPr>
-          <w:b/>
-          <w:bCs/>
-          <w:sz w:val="24"/>
-          <w:szCs w:val="24"/>
-        </w:rPr>
-        <w:t>3. Premium Farmer Status &amp; Limit Activation</w:t>
-      </w:r>
-    </w:p>
-    <w:p>
-      <w:pPr>
-        <w:rPr>
-          <w:sz w:val="24"/>
-          <w:szCs w:val="24"/>
-        </w:rPr>
-      </w:pPr>
-      <w:r>
-        <w:rPr>
-          <w:sz w:val="24"/>
-          <w:szCs w:val="24"/>
-        </w:rPr>
-        <w:t>After successful payment and admin approval:</w:t>
-      </w:r>
-    </w:p>
-    <w:p>
-      <w:pPr>
-        <w:numPr>
-          <w:ilvl w:val="0"/>
-          <w:numId w:val="28"/>
-        </w:numPr>
-        <w:rPr>
-          <w:sz w:val="24"/>
-          <w:szCs w:val="24"/>
-        </w:rPr>
-      </w:pPr>
-      <w:r>
-        <w:rPr>
-          <w:sz w:val="24"/>
-          <w:szCs w:val="24"/>
-        </w:rPr>
-        <w:t>The farmer's account will be upgraded to Premium Farmer status.</w:t>
-      </w:r>
-    </w:p>
-    <w:p>
-      <w:pPr>
-        <w:numPr>
-          <w:ilvl w:val="0"/>
-          <w:numId w:val="28"/>
-        </w:numPr>
-        <w:rPr>
-          <w:sz w:val="24"/>
-          <w:szCs w:val="24"/>
-        </w:rPr>
-      </w:pPr>
-      <w:r>
-        <w:rPr>
-          <w:sz w:val="24"/>
-          <w:szCs w:val="24"/>
-        </w:rPr>
-        <w:lastRenderedPageBreak/>
-        <w:t xml:space="preserve">A </w:t>
-      </w:r>
-      <w:r>
-        <w:rPr>
-          <w:b/>
-          <w:bCs/>
-          <w:sz w:val="24"/>
-          <w:szCs w:val="24"/>
-        </w:rPr>
-        <w:t>“Premium Farmer”</w:t>
-      </w:r>
-      <w:r>
-        <w:rPr>
-          <w:sz w:val="24"/>
-          <w:szCs w:val="24"/>
-        </w:rPr>
-        <w:t xml:space="preserve"> badge or label will be displayed in the Farmer App.</w:t>
-      </w:r>
-    </w:p>
-    <w:p>
-      <w:pPr>
-        <w:numPr>
-          <w:ilvl w:val="0"/>
-          <w:numId w:val="28"/>
-        </w:numPr>
-        <w:rPr>
-          <w:sz w:val="24"/>
-          <w:szCs w:val="24"/>
-        </w:rPr>
-      </w:pPr>
-      <w:r>
-        <w:rPr>
-          <w:sz w:val="24"/>
-          <w:szCs w:val="24"/>
-        </w:rPr>
-        <w:t>The limit configured by the admin will be assigned to the farmer's account.</w:t>
-      </w:r>
-    </w:p>
-    <w:p>
-      <w:pPr>
-        <w:numPr>
-          <w:ilvl w:val="0"/>
-          <w:numId w:val="28"/>
-        </w:numPr>
-        <w:rPr>
-          <w:sz w:val="24"/>
-          <w:szCs w:val="24"/>
-        </w:rPr>
-      </w:pPr>
-      <w:r>
-        <w:rPr>
-          <w:sz w:val="24"/>
-          <w:szCs w:val="24"/>
-        </w:rPr>
-        <w:t>The farmer will be able to access the applicable premium benefits and features according to the assigned limit and approved business rules.</w:t>
-      </w:r>
-    </w:p>
-    <w:p>
-      <w:pPr>
-        <w:rPr>
-          <w:sz w:val="24"/>
-          <w:szCs w:val="24"/>
-        </w:rPr>
-      </w:pPr>
-      <w:r>
-        <w:rPr>
-          <w:sz w:val="24"/>
-          <w:szCs w:val="24"/>
-        </w:rPr>
-        <w:t>Payment alone will not activate Premium Farmer status or the assigned limit. Activation will take place only after admin approval.</w:t>
-      </w:r>
-    </w:p>
-    <w:p>
-      <w:pPr>
-        <w:rPr>
-          <w:b/>
-          <w:bCs/>
-          <w:sz w:val="24"/>
-          <w:szCs w:val="24"/>
-        </w:rPr>
-      </w:pPr>
-      <w:r>
-        <w:rPr>
-          <w:b/>
-          <w:bCs/>
-          <w:sz w:val="24"/>
-          <w:szCs w:val="24"/>
-        </w:rPr>
-        <w:t>4. Expected Outcome</w:t>
-      </w:r>
-    </w:p>
-    <w:p>
-      <w:pPr>
-        <w:rPr>
-          <w:sz w:val="24"/>
-          <w:szCs w:val="24"/>
-        </w:rPr>
-      </w:pPr>
-      <w:r>
-        <w:rPr>
-          <w:sz w:val="24"/>
-          <w:szCs w:val="24"/>
-        </w:rPr>
-        <w:t>The Premium Farmer Module will provide a structured process for farmers to apply for premium membership, accept the applicable terms, complete payment, and receive approval.</w:t>
-      </w:r>
-    </w:p>
-    <w:p>
-      <w:pPr>
-        <w:rPr>
-          <w:sz w:val="24"/>
-          <w:szCs w:val="24"/>
-        </w:rPr>
-      </w:pPr>
-      <w:r>
-        <w:rPr>
-          <w:sz w:val="24"/>
-          <w:szCs w:val="24"/>
-        </w:rPr>
-        <w:t>The Admin Panel will provide centralized management of Premium Farmer terms, applications, payments, approvals, and individual farmer limits, ensuring transparent tracking and controlled activation of premium accounts.</w:t>
-      </w:r>
+          <w:sz w:val="24"/>
+          <w:szCs w:val="24"/>
+        </w:rPr>
+      </w:pPr>
     </w:p>
     <w:sectPr>
       <w:headerReference w:type="even" r:id="rId7"/>
       <w:headerReference w:type="default" r:id="rId8"/>
-      <w:footerReference w:type="even" r:id="rId9"/>
-      <w:footerReference w:type="default" r:id="rId10"/>
-      <w:headerReference w:type="first" r:id="rId11"/>
-      <w:footerReference w:type="first" r:id="rId12"/>
+      <w:headerReference w:type="first" r:id="rId9"/>
       <w:pgSz w:w="11906" w:h="16838"/>
       <w:pgMar w:top="1440" w:right="1440" w:bottom="1440" w:left="1440" w:header="708" w:footer="708" w:gutter="0"/>
       <w:cols w:space="708"/>
@@ -4049,36 +3530,6 @@
     </w:p>
   </w:endnote>
 </w:endnotes>
-</file>
-
-<file path=word/footer1.xml><?xml version="1.0" encoding="utf-8"?>
-<w:ftr xmlns:wpc="http://schemas.microsoft.com/office/word/2010/wordprocessingCanvas" xmlns:cx="http://schemas.microsoft.com/office/drawing/2014/chartex" xmlns:cx1="http://schemas.microsoft.com/office/drawing/2015/9/8/chartex" xmlns:cx2="http://schemas.microsoft.com/office/drawing/2015/10/21/chartex" xmlns:cx3="http://schemas.microsoft.com/office/drawing/2016/5/9/chartex" xmlns:cx4="http://schemas.microsoft.com/office/drawing/2016/5/10/chartex" xmlns:cx5="http://schemas.microsoft.com/office/drawing/2016/5/11/chartex" xmlns:cx6="http://schemas.microsoft.com/office/drawing/2016/5/12/chartex" xmlns:cx7="http://schemas.microsoft.com/office/drawing/2016/5/13/chartex" xmlns:cx8="http://schemas.microsoft.com/office/drawing/2016/5/14/chartex" xmlns:mc="http://schemas.openxmlformats.org/markup-compatibility/2006" xmlns:aink="http://schemas.microsoft.com/office/drawing/2016/ink" xmlns:am3d="http://schemas.microsoft.com/office/drawing/2017/model3d" xmlns:o="urn:schemas-microsoft-com:office:office" xmlns:oel="http://schemas.microsoft.com/office/2019/extlst" xmlns:r="http://schemas.openxmlformats.org/officeDocument/2006/relationships" xmlns:m="http://schemas.openxmlformats.org/officeDocument/2006/math" xmlns:v="urn:schemas-microsoft-com:vml" xmlns:wp14="http://schemas.microsoft.com/office/word/2010/wordprocessingDrawing" xmlns:wp="http://schemas.openxmlformats.org/drawingml/2006/wordprocessingDrawing" xmlns:w10="urn:schemas-microsoft-com:office:word" xmlns:w="http://schemas.openxmlformats.org/wordprocessingml/2006/main" xmlns:w14="http://schemas.microsoft.com/office/word/2010/wordml" xmlns:w15="http://schemas.microsoft.com/office/word/2012/wordml" xmlns:w16cex="http://schemas.microsoft.com/office/word/2018/wordml/cex" xmlns:w16cid="http://schemas.microsoft.com/office/word/2016/wordml/cid" xmlns:w16="http://schemas.microsoft.com/office/word/2018/wordml" xmlns:w16du="http://schemas.microsoft.com/office/word/2023/wordml/word16du" xmlns:w16sdtdh="http://schemas.microsoft.com/office/word/2020/wordml/sdtdatahash" xmlns:w16sdtfl="http://schemas.microsoft.com/office/word/2024/wordml/sdtformatlock" xmlns:w16se="http://schemas.microsoft.com/office/word/2015/wordml/symex" xmlns:wpg="http://schemas.microsoft.com/office/word/2010/wordprocessingGroup" xmlns:wpi="http://schemas.microsoft.com/office/word/2010/wordprocessingInk" xmlns:wne="http://schemas.microsoft.com/office/word/2006/wordml" xmlns:wps="http://schemas.microsoft.com/office/word/2010/wordprocessingShape" mc:Ignorable="w14 w15 w16se w16cid w16 w16cex w16sdtdh w16sdtfl w16du wp14">
-  <w:p>
-    <w:pPr>
-      <w:pStyle w:val="Footer"/>
-    </w:pPr>
-  </w:p>
-</w:ftr>
-</file>
-
-<file path=word/footer2.xml><?xml version="1.0" encoding="utf-8"?>
-<w:ftr xmlns:wpc="http://schemas.microsoft.com/office/word/2010/wordprocessingCanvas" xmlns:cx="http://schemas.microsoft.com/office/drawing/2014/chartex" xmlns:cx1="http://schemas.microsoft.com/office/drawing/2015/9/8/chartex" xmlns:cx2="http://schemas.microsoft.com/office/drawing/2015/10/21/chartex" xmlns:cx3="http://schemas.microsoft.com/office/drawing/2016/5/9/chartex" xmlns:cx4="http://schemas.microsoft.com/office/drawing/2016/5/10/chartex" xmlns:cx5="http://schemas.microsoft.com/office/drawing/2016/5/11/chartex" xmlns:cx6="http://schemas.microsoft.com/office/drawing/2016/5/12/chartex" xmlns:cx7="http://schemas.microsoft.com/office/drawing/2016/5/13/chartex" xmlns:cx8="http://schemas.microsoft.com/office/drawing/2016/5/14/chartex" xmlns:mc="http://schemas.openxmlformats.org/markup-compatibility/2006" xmlns:aink="http://schemas.microsoft.com/office/drawing/2016/ink" xmlns:am3d="http://schemas.microsoft.com/office/drawing/2017/model3d" xmlns:o="urn:schemas-microsoft-com:office:office" xmlns:oel="http://schemas.microsoft.com/office/2019/extlst" xmlns:r="http://schemas.openxmlformats.org/officeDocument/2006/relationships" xmlns:m="http://schemas.openxmlformats.org/officeDocument/2006/math" xmlns:v="urn:schemas-microsoft-com:vml" xmlns:wp14="http://schemas.microsoft.com/office/word/2010/wordprocessingDrawing" xmlns:wp="http://schemas.openxmlformats.org/drawingml/2006/wordprocessingDrawing" xmlns:w10="urn:schemas-microsoft-com:office:word" xmlns:w="http://schemas.openxmlformats.org/wordprocessingml/2006/main" xmlns:w14="http://schemas.microsoft.com/office/word/2010/wordml" xmlns:w15="http://schemas.microsoft.com/office/word/2012/wordml" xmlns:w16cex="http://schemas.microsoft.com/office/word/2018/wordml/cex" xmlns:w16cid="http://schemas.microsoft.com/office/word/2016/wordml/cid" xmlns:w16="http://schemas.microsoft.com/office/word/2018/wordml" xmlns:w16du="http://schemas.microsoft.com/office/word/2023/wordml/word16du" xmlns:w16sdtdh="http://schemas.microsoft.com/office/word/2020/wordml/sdtdatahash" xmlns:w16sdtfl="http://schemas.microsoft.com/office/word/2024/wordml/sdtformatlock" xmlns:w16se="http://schemas.microsoft.com/office/word/2015/wordml/symex" xmlns:wpg="http://schemas.microsoft.com/office/word/2010/wordprocessingGroup" xmlns:wpi="http://schemas.microsoft.com/office/word/2010/wordprocessingInk" xmlns:wne="http://schemas.microsoft.com/office/word/2006/wordml" xmlns:wps="http://schemas.microsoft.com/office/word/2010/wordprocessingShape" mc:Ignorable="w14 w15 w16se w16cid w16 w16cex w16sdtdh w16sdtfl w16du wp14">
-  <w:p>
-    <w:pPr>
-      <w:pStyle w:val="Footer"/>
-    </w:pPr>
-  </w:p>
-</w:ftr>
-</file>
-
-<file path=word/footer3.xml><?xml version="1.0" encoding="utf-8"?>
-<w:ftr xmlns:wpc="http://schemas.microsoft.com/office/word/2010/wordprocessingCanvas" xmlns:cx="http://schemas.microsoft.com/office/drawing/2014/chartex" xmlns:cx1="http://schemas.microsoft.com/office/drawing/2015/9/8/chartex" xmlns:cx2="http://schemas.microsoft.com/office/drawing/2015/10/21/chartex" xmlns:cx3="http://schemas.microsoft.com/office/drawing/2016/5/9/chartex" xmlns:cx4="http://schemas.microsoft.com/office/drawing/2016/5/10/chartex" xmlns:cx5="http://schemas.microsoft.com/office/drawing/2016/5/11/chartex" xmlns:cx6="http://schemas.microsoft.com/office/drawing/2016/5/12/chartex" xmlns:cx7="http://schemas.microsoft.com/office/drawing/2016/5/13/chartex" xmlns:cx8="http://schemas.microsoft.com/office/drawing/2016/5/14/chartex" xmlns:mc="http://schemas.openxmlformats.org/markup-compatibility/2006" xmlns:aink="http://schemas.microsoft.com/office/drawing/2016/ink" xmlns:am3d="http://schemas.microsoft.com/office/drawing/2017/model3d" xmlns:o="urn:schemas-microsoft-com:office:office" xmlns:oel="http://schemas.microsoft.com/office/2019/extlst" xmlns:r="http://schemas.openxmlformats.org/officeDocument/2006/relationships" xmlns:m="http://schemas.openxmlformats.org/officeDocument/2006/math" xmlns:v="urn:schemas-microsoft-com:vml" xmlns:wp14="http://schemas.microsoft.com/office/word/2010/wordprocessingDrawing" xmlns:wp="http://schemas.openxmlformats.org/drawingml/2006/wordprocessingDrawing" xmlns:w10="urn:schemas-microsoft-com:office:word" xmlns:w="http://schemas.openxmlformats.org/wordprocessingml/2006/main" xmlns:w14="http://schemas.microsoft.com/office/word/2010/wordml" xmlns:w15="http://schemas.microsoft.com/office/word/2012/wordml" xmlns:w16cex="http://schemas.microsoft.com/office/word/2018/wordml/cex" xmlns:w16cid="http://schemas.microsoft.com/office/word/2016/wordml/cid" xmlns:w16="http://schemas.microsoft.com/office/word/2018/wordml" xmlns:w16du="http://schemas.microsoft.com/office/word/2023/wordml/word16du" xmlns:w16sdtdh="http://schemas.microsoft.com/office/word/2020/wordml/sdtdatahash" xmlns:w16sdtfl="http://schemas.microsoft.com/office/word/2024/wordml/sdtformatlock" xmlns:w16se="http://schemas.microsoft.com/office/word/2015/wordml/symex" xmlns:wpg="http://schemas.microsoft.com/office/word/2010/wordprocessingGroup" xmlns:wpi="http://schemas.microsoft.com/office/word/2010/wordprocessingInk" xmlns:wne="http://schemas.microsoft.com/office/word/2006/wordml" xmlns:wps="http://schemas.microsoft.com/office/word/2010/wordprocessingShape" mc:Ignorable="w14 w15 w16se w16cid w16 w16cex w16sdtdh w16sdtfl w16du wp14">
-  <w:p>
-    <w:pPr>
-      <w:pStyle w:val="Footer"/>
-    </w:pPr>
-  </w:p>
-</w:ftr>
 </file>
 
 <file path=word/footnotes.xml><?xml version="1.0" encoding="utf-8"?>

</xml_diff>